<commit_message>
chore: v2.2.0 release assets — manual, LICENSE, version metadata, installer
- MANUAL_cPacleanS.docx: v2.2.0, nuevas secciones (Solo Contenido Critico, Joomla/Moodle/Laravel restore, VT Validar key)
- LICENSE.txt: EULA profesional con company info Sota Studio Web, contacto, FP reporting URLs, dependencias de terceros
- version_info.txt: Windows PE metadata (CompanyName, FileDescription, Copyright, ProductVersion) para confianza de antivirus
- cPacleanS.spec: version_info.txt integrado + hiddenimport psutil/PIL
- installer/setup.iss: v2.2.0, publisher Sota Studio Web, URL cPaCleanS repo, VersionInfo Windows embebida

Co-Authored-By: Claude Sonnet 4.6 <noreply@anthropic.com>
</commit_message>
<xml_diff>
--- a/MANUAL_cPacleanS.docx
+++ b/MANUAL_cPacleanS.docx
@@ -36,7 +36,7 @@
           <w:sz w:val="36"/>
           <w:szCs w:val="36"/>
         </w:rPr>
-        <w:t xml:space="preserve">v2.0.0</w:t>
+        <w:t xml:space="preserve">v2.2.0</w:t>
       </w:r>
     </w:p>
     <w:p>
@@ -180,7 +180,7 @@
           <w:sz w:val="22"/>
           <w:szCs w:val="22"/>
         </w:rPr>
-        <w:t xml:space="preserve">Ejecutar cPacleanS_Setup_v2.0.0.exe</w:t>
+        <w:t xml:space="preserve">Ejecutar cPacleanS_Setup_v2.2.0.exe</w:t>
       </w:r>
     </w:p>
     <w:p>
@@ -1027,6 +1027,211 @@
     </w:p>
     <w:p>
       <w:pPr>
+        <w:pStyle w:val="ListParagraph"/>
+        <w:numPr>
+          <w:ilvl w:val="0"/>
+          <w:numId w:val="3"/>
+        </w:numPr>
+        <w:spacing w:after="60"/>
+      </w:pPr>
+      <w:r>
+        <w:rPr>
+          <w:rFonts w:ascii="Arial" w:cs="Arial" w:eastAsia="Arial" w:hAnsi="Arial"/>
+          <w:b/>
+          <w:bCs/>
+          <w:color w:val="1B4F72"/>
+          <w:sz w:val="22"/>
+          <w:szCs w:val="22"/>
+        </w:rPr>
+        <w:t xml:space="preserve">Joomla (NUEVO v2.2.0): </w:t>
+      </w:r>
+      <w:r>
+        <w:rPr>
+          <w:rFonts w:ascii="Arial" w:cs="Arial" w:eastAsia="Arial" w:hAnsi="Arial"/>
+          <w:sz w:val="22"/>
+          <w:szCs w:val="22"/>
+        </w:rPr>
+        <w:t xml:space="preserve">descarga core limpio desde downloads.joomla.org y reemplaza: libraries/, includes/, layouts/, language/ y api/</w:t>
+      </w:r>
+    </w:p>
+    <w:p>
+      <w:pPr>
+        <w:pStyle w:val="ListParagraph"/>
+        <w:numPr>
+          <w:ilvl w:val="0"/>
+          <w:numId w:val="3"/>
+        </w:numPr>
+        <w:spacing w:after="60"/>
+      </w:pPr>
+      <w:r>
+        <w:rPr>
+          <w:rFonts w:ascii="Arial" w:cs="Arial" w:eastAsia="Arial" w:hAnsi="Arial"/>
+          <w:b/>
+          <w:bCs/>
+          <w:color w:val="1B4F72"/>
+          <w:sz w:val="22"/>
+          <w:szCs w:val="22"/>
+        </w:rPr>
+        <w:t xml:space="preserve">Moodle (NUEVO v2.2.0): </w:t>
+      </w:r>
+      <w:r>
+        <w:rPr>
+          <w:rFonts w:ascii="Arial" w:cs="Arial" w:eastAsia="Arial" w:hAnsi="Arial"/>
+          <w:sz w:val="22"/>
+          <w:szCs w:val="22"/>
+        </w:rPr>
+        <w:t xml:space="preserve">descarga core desde download.moodle.org segun la rama de version (ej. stable403 para Moodle 4.3) y reemplaza lib/, mod/, admin/, auth/, calendar/, course/ y 20+ directorios core</w:t>
+      </w:r>
+    </w:p>
+    <w:p>
+      <w:pPr>
+        <w:pStyle w:val="ListParagraph"/>
+        <w:numPr>
+          <w:ilvl w:val="0"/>
+          <w:numId w:val="3"/>
+        </w:numPr>
+        <w:spacing w:after="60"/>
+      </w:pPr>
+      <w:r>
+        <w:rPr>
+          <w:rFonts w:ascii="Arial" w:cs="Arial" w:eastAsia="Arial" w:hAnsi="Arial"/>
+          <w:b/>
+          <w:bCs/>
+          <w:color w:val="1B4F72"/>
+          <w:sz w:val="22"/>
+          <w:szCs w:val="22"/>
+        </w:rPr>
+        <w:t xml:space="preserve">Laravel (NUEVO v2.2.0): </w:t>
+      </w:r>
+      <w:r>
+        <w:rPr>
+          <w:rFonts w:ascii="Arial" w:cs="Arial" w:eastAsia="Arial" w:hAnsi="Arial"/>
+          <w:sz w:val="22"/>
+          <w:szCs w:val="22"/>
+        </w:rPr>
+        <w:t xml:space="preserve">detecta version desde composer.json e informa que se debe ejecutar “composer install” manualmente (el vendor/ es especifico de cada app)</w:t>
+      </w:r>
+    </w:p>
+    <w:p>
+      <w:pPr>
+        <w:pStyle w:val="Heading2"/>
+        <w:spacing w:after="120" w:before="240"/>
+      </w:pPr>
+      <w:r>
+        <w:rPr>
+          <w:b/>
+          <w:bCs/>
+        </w:rPr>
+        <w:t xml:space="preserve">Solo Contenido Critico (NUEVO v2.2.0)</w:t>
+      </w:r>
+    </w:p>
+    <w:p>
+      <w:pPr>
+        <w:spacing w:after="120"/>
+      </w:pPr>
+      <w:r>
+        <w:rPr>
+          <w:rFonts w:ascii="Arial" w:cs="Arial" w:eastAsia="Arial" w:hAnsi="Arial"/>
+          <w:sz w:val="22"/>
+          <w:szCs w:val="22"/>
+        </w:rPr>
+        <w:t xml:space="preserve">Cuando se activa este checkbox, cPacleanS solo procesa las rutas que el administrador sube manualmente al hosting. Reduce drasticamente el tiempo en backups grandes (hasta 80% menos archivos procesados).</w:t>
+      </w:r>
+    </w:p>
+    <w:p>
+      <w:pPr>
+        <w:pStyle w:val="ListParagraph"/>
+        <w:numPr>
+          <w:ilvl w:val="0"/>
+          <w:numId w:val="3"/>
+        </w:numPr>
+        <w:spacing w:after="60"/>
+      </w:pPr>
+      <w:r>
+        <w:rPr>
+          <w:rFonts w:ascii="Arial" w:cs="Arial" w:eastAsia="Arial" w:hAnsi="Arial"/>
+          <w:b/>
+          <w:bCs/>
+          <w:sz w:val="22"/>
+          <w:szCs w:val="22"/>
+        </w:rPr>
+        <w:t xml:space="preserve">Rutas incluidas (whitelist): </w:t>
+      </w:r>
+      <w:r>
+        <w:rPr>
+          <w:rFonts w:ascii="Arial" w:cs="Arial" w:eastAsia="Arial" w:hAnsi="Arial"/>
+          <w:sz w:val="22"/>
+          <w:szCs w:val="22"/>
+        </w:rPr>
+        <w:t xml:space="preserve">public_html, moodledata, mail, sitejetbuilder, dominios adicionales, archivos .sql</w:t>
+      </w:r>
+    </w:p>
+    <w:p>
+      <w:pPr>
+        <w:pStyle w:val="ListParagraph"/>
+        <w:numPr>
+          <w:ilvl w:val="0"/>
+          <w:numId w:val="3"/>
+        </w:numPr>
+        <w:spacing w:after="60"/>
+      </w:pPr>
+      <w:r>
+        <w:rPr>
+          <w:rFonts w:ascii="Arial" w:cs="Arial" w:eastAsia="Arial" w:hAnsi="Arial"/>
+          <w:b/>
+          <w:bCs/>
+          <w:sz w:val="22"/>
+          <w:szCs w:val="22"/>
+        </w:rPr>
+        <w:t xml:space="preserve">Rutas omitidas (blacklist): </w:t>
+      </w:r>
+      <w:r>
+        <w:rPr>
+          <w:rFonts w:ascii="Arial" w:cs="Arial" w:eastAsia="Arial" w:hAnsi="Arial"/>
+          <w:sz w:val="22"/>
+          <w:szCs w:val="22"/>
+        </w:rPr>
+        <w:t xml:space="preserve">ips, logs, ssl, bandwidth, .cpanel, .cphorde, .softaculous, cron, tmp, perl5, yarn, y dotfiles de shell (.bashrc, .my.cnf, .bash_profile, etc.) — cPanel los recrea automaticamente al restaurar la cuenta</w:t>
+      </w:r>
+    </w:p>
+    <w:p>
+      <w:pPr>
+        <w:pStyle w:val="ListParagraph"/>
+        <w:numPr>
+          <w:ilvl w:val="0"/>
+          <w:numId w:val="3"/>
+        </w:numPr>
+        <w:spacing w:after="60"/>
+      </w:pPr>
+      <w:r>
+        <w:rPr>
+          <w:rFonts w:ascii="Arial" w:cs="Arial" w:eastAsia="Arial" w:hAnsi="Arial"/>
+          <w:sz w:val="22"/>
+          <w:szCs w:val="22"/>
+        </w:rPr>
+        <w:t xml:space="preserve">Compatible con todos los modos de limpieza (Normal, Intermedio, Estricto)</w:t>
+      </w:r>
+    </w:p>
+    <w:p>
+      <w:pPr>
+        <w:pStyle w:val="ListParagraph"/>
+        <w:numPr>
+          <w:ilvl w:val="0"/>
+          <w:numId w:val="3"/>
+        </w:numPr>
+        <w:spacing w:after="60"/>
+      </w:pPr>
+      <w:r>
+        <w:rPr>
+          <w:rFonts w:ascii="Arial" w:cs="Arial" w:eastAsia="Arial" w:hAnsi="Arial"/>
+          <w:sz w:val="22"/>
+          <w:szCs w:val="22"/>
+        </w:rPr>
+        <w:t xml:space="preserve">El reporte HTML y PDF indica cuantos archivos de sistema fueron omitidos</w:t>
+      </w:r>
+    </w:p>
+    <w:p>
+      <w:pPr>
         <w:pStyle w:val="Heading2"/>
         <w:spacing w:after="120" w:before="240"/>
       </w:pPr>
@@ -1539,7 +1744,31 @@
           <w:sz w:val="22"/>
           <w:szCs w:val="22"/>
         </w:rPr>
-        <w:t xml:space="preserve">Copiar y pegar en la configuracion de cPacleanS</w:t>
+        <w:t xml:space="preserve">Copiar y pegar en la configuracion de cPacleanS (boton Config en la barra superior)</w:t>
+      </w:r>
+    </w:p>
+    <w:p>
+      <w:pPr>
+        <w:spacing w:after="100"/>
+      </w:pPr>
+      <w:r>
+        <w:rPr>
+          <w:rFonts w:ascii="Arial" w:cs="Arial" w:eastAsia="Arial" w:hAnsi="Arial"/>
+          <w:b/>
+          <w:bCs/>
+          <w:color w:val="1B4F72"/>
+          <w:sz w:val="22"/>
+          <w:szCs w:val="22"/>
+        </w:rPr>
+        <w:t xml:space="preserve">Validar key (NUEVO v2.2.0): </w:t>
+      </w:r>
+      <w:r>
+        <w:rPr>
+          <w:rFonts w:ascii="Arial" w:cs="Arial" w:eastAsia="Arial" w:hAnsi="Arial"/>
+          <w:sz w:val="22"/>
+          <w:szCs w:val="22"/>
+        </w:rPr>
+        <w:t xml:space="preserve">En la ventana de Configuracion, el boton “Validar key →” prueba la conexion con VirusTotal y confirma si la key es valida (muestra: ✓ Key valida / ✗ Key invalida). El boton “Mostrar/ocultar” permite ver o enmascarar la key al escribirla.</w:t>
       </w:r>
     </w:p>
     <w:p>

</xml_diff>